<commit_message>
docs(livrables): add 6 MSPR deliverables with screenshots
- 01_Note_de_Cadrage (14 pages, 3 captures)
- 02_Analyse_des_Risques (15 pages, 3 captures)
- 03_Dossier_de_Veille (14 pages, 2 captures)
- 04_Benchmark_Solutions (13 pages, 4 captures)
- 05_Audit_Donnees (14 pages, 5 captures)
- 06_Note_de_Faisabilite (15 pages, 7 captures)

Available in both .docx (editable)
</commit_message>
<xml_diff>
--- a/reports/livrables/01_Note_de_Cadrage.docx
+++ b/reports/livrables/01_Note_de_Cadrage.docx
@@ -5729,6 +5729,57 @@
     </w:p>
     <w:p>
       <w:pPr>
+        <w:jc w:val="center"/>
+      </w:pPr>
+      <w:r>
+        <w:drawing>
+          <wp:inline xmlns:a="http://schemas.openxmlformats.org/drawingml/2006/main" xmlns:pic="http://schemas.openxmlformats.org/drawingml/2006/picture">
+            <wp:extent cx="5303520" cy="1732894"/>
+            <wp:docPr id="1" name="Picture 1"/>
+            <wp:cNvGraphicFramePr>
+              <a:graphicFrameLocks noChangeAspect="1"/>
+            </wp:cNvGraphicFramePr>
+            <a:graphic>
+              <a:graphicData uri="http://schemas.openxmlformats.org/drawingml/2006/picture">
+                <pic:pic>
+                  <pic:nvPicPr>
+                    <pic:cNvPr id="0" name="01_dashboard_home_kpis.png"/>
+                    <pic:cNvPicPr/>
+                  </pic:nvPicPr>
+                  <pic:blipFill>
+                    <a:blip r:embed="rId10"/>
+                    <a:stretch>
+                      <a:fillRect/>
+                    </a:stretch>
+                  </pic:blipFill>
+                  <pic:spPr>
+                    <a:xfrm>
+                      <a:off x="0" y="0"/>
+                      <a:ext cx="5303520" cy="1732894"/>
+                    </a:xfrm>
+                    <a:prstGeom prst="rect"/>
+                  </pic:spPr>
+                </pic:pic>
+              </a:graphicData>
+            </a:graphic>
+          </wp:inline>
+        </w:drawing>
+      </w:r>
+    </w:p>
+    <w:p>
+      <w:pPr>
+        <w:jc w:val="center"/>
+      </w:pPr>
+      <w:r>
+        <w:rPr>
+          <w:i/>
+          <w:sz w:val="18"/>
+        </w:rPr>
+        <w:t>Figure - Vue d'ensemble de la solution : dashboard Streamlit multi-pages presentant les KPIs consolides du groupe (10 070 pieces, TRS 26,1 %, 332 pannes, 1 055 kWh)</w:t>
+      </w:r>
+    </w:p>
+    <w:p>
+      <w:pPr>
         <w:spacing w:after="120" w:line="300"/>
         <w:jc w:val="both"/>
       </w:pPr>
@@ -5899,6 +5950,57 @@
           <w:szCs w:val="26"/>
         </w:rPr>
         <w:t xml:space="preserve">5.3. Mockup du dashboard cible</w:t>
+      </w:r>
+    </w:p>
+    <w:p>
+      <w:pPr>
+        <w:jc w:val="center"/>
+      </w:pPr>
+      <w:r>
+        <w:drawing>
+          <wp:inline xmlns:a="http://schemas.openxmlformats.org/drawingml/2006/main" xmlns:pic="http://schemas.openxmlformats.org/drawingml/2006/picture">
+            <wp:extent cx="5303520" cy="1792765"/>
+            <wp:docPr id="2" name="Picture 2"/>
+            <wp:cNvGraphicFramePr>
+              <a:graphicFrameLocks noChangeAspect="1"/>
+            </wp:cNvGraphicFramePr>
+            <a:graphic>
+              <a:graphicData uri="http://schemas.openxmlformats.org/drawingml/2006/picture">
+                <pic:pic>
+                  <pic:nvPicPr>
+                    <pic:cNvPr id="0" name="02_dashboard_home_courbes.png"/>
+                    <pic:cNvPicPr/>
+                  </pic:nvPicPr>
+                  <pic:blipFill>
+                    <a:blip r:embed="rId11"/>
+                    <a:stretch>
+                      <a:fillRect/>
+                    </a:stretch>
+                  </pic:blipFill>
+                  <pic:spPr>
+                    <a:xfrm>
+                      <a:off x="0" y="0"/>
+                      <a:ext cx="5303520" cy="1792765"/>
+                    </a:xfrm>
+                    <a:prstGeom prst="rect"/>
+                  </pic:spPr>
+                </pic:pic>
+              </a:graphicData>
+            </a:graphic>
+          </wp:inline>
+        </w:drawing>
+      </w:r>
+    </w:p>
+    <w:p>
+      <w:pPr>
+        <w:jc w:val="center"/>
+      </w:pPr>
+      <w:r>
+        <w:rPr>
+          <w:i/>
+          <w:sz w:val="18"/>
+        </w:rPr>
+        <w:t>Figure - Mockup realise : courbes de suivi journalier du TRS par usine (objectif 85 %) et du taux de rebut (seuil d'alerte 5 %)</w:t>
       </w:r>
     </w:p>
     <w:p>
@@ -9060,6 +9162,57 @@
           <w:szCs w:val="32"/>
         </w:rPr>
         <w:t xml:space="preserve">8. Gouvernance du projet</w:t>
+      </w:r>
+    </w:p>
+    <w:p>
+      <w:pPr>
+        <w:jc w:val="center"/>
+      </w:pPr>
+      <w:r>
+        <w:drawing>
+          <wp:inline xmlns:a="http://schemas.openxmlformats.org/drawingml/2006/main" xmlns:pic="http://schemas.openxmlformats.org/drawingml/2006/picture">
+            <wp:extent cx="5303520" cy="2857323"/>
+            <wp:docPr id="3" name="Picture 3"/>
+            <wp:cNvGraphicFramePr>
+              <a:graphicFrameLocks noChangeAspect="1"/>
+            </wp:cNvGraphicFramePr>
+            <a:graphic>
+              <a:graphicData uri="http://schemas.openxmlformats.org/drawingml/2006/picture">
+                <pic:pic>
+                  <pic:nvPicPr>
+                    <pic:cNvPr id="0" name="28_github_repo_mspr.png"/>
+                    <pic:cNvPicPr/>
+                  </pic:nvPicPr>
+                  <pic:blipFill>
+                    <a:blip r:embed="rId12"/>
+                    <a:stretch>
+                      <a:fillRect/>
+                    </a:stretch>
+                  </pic:blipFill>
+                  <pic:spPr>
+                    <a:xfrm>
+                      <a:off x="0" y="0"/>
+                      <a:ext cx="5303520" cy="2857323"/>
+                    </a:xfrm>
+                    <a:prstGeom prst="rect"/>
+                  </pic:spPr>
+                </pic:pic>
+              </a:graphicData>
+            </a:graphic>
+          </wp:inline>
+        </w:drawing>
+      </w:r>
+    </w:p>
+    <w:p>
+      <w:pPr>
+        <w:jc w:val="center"/>
+      </w:pPr>
+      <w:r>
+        <w:rPr>
+          <w:i/>
+          <w:sz w:val="18"/>
+        </w:rPr>
+        <w:t>Figure - Gouvernance technique : depot GitHub du projet (branche main, 24 commits, structure complete)</w:t>
       </w:r>
     </w:p>
     <w:p>

</xml_diff>